<commit_message>
ultimas correcciones DEFUNCION RENIEC
</commit_message>
<xml_diff>
--- a/plantillas/oficio_defuncion_reniec.docx
+++ b/plantillas/oficio_defuncion_reniec.docx
@@ -4,20 +4,27 @@
   <w:body>
     <w:p>
       <w:pPr>
-        <w:pStyle w:val="Normal"/>
         <w:keepNext/>
-        <w:spacing w:before="360" w:after="0"/>
+        <w:spacing w:before="360"/>
         <w:jc w:val="center"/>
-        <w:ind w:left="0" w:firstLine="0" w:right="0"/>
-      </w:pPr>
-      <w:r>
-        <w:rPr>
-          <w:rFonts w:ascii="Arial" w:hAnsi="Arial" w:cs="Arial" w:eastAsia="Arial"/>
-          <w:sz w:val="20"/>
-          <w:szCs w:val="20"/>
+        <w:rPr>
+          <w:rFonts w:ascii="Arial" w:eastAsia="Arial" w:hAnsi="Arial" w:cs="Arial"/>
           <w:i/>
         </w:rPr>
-        <w:t xml:space="preserve">${nombre_oficial_ano}</w:t>
+      </w:pPr>
+    </w:p>
+    <w:p>
+      <w:pPr>
+        <w:keepNext/>
+        <w:spacing w:before="360"/>
+        <w:jc w:val="center"/>
+      </w:pPr>
+      <w:r>
+        <w:rPr>
+          <w:rFonts w:ascii="Arial" w:eastAsia="Arial" w:hAnsi="Arial" w:cs="Arial"/>
+          <w:i/>
+        </w:rPr>
+        <w:t>${nombre_oficial_ano}</w:t>
       </w:r>
     </w:p>
     <w:p>
@@ -51,7 +58,7 @@
         <w:rPr>
           <w:rFonts w:cs="Arial"/>
         </w:rPr>
-        <w:t xml:space="preserve">Santa Rosa, ${oficio_fecha}.</w:t>
+        <w:t>Santa Rosa, ${oficio_fecha}.</w:t>
       </w:r>
     </w:p>
     <w:p>
@@ -81,22 +88,22 @@
     </w:p>
     <w:p>
       <w:pPr>
-        <w:pStyle w:val="Normal"/>
         <w:keepNext/>
-        <w:spacing w:before="0" w:after="0"/>
-        <w:jc w:val="left"/>
-        <w:ind w:left="0" w:firstLine="0" w:right="0"/>
-      </w:pPr>
-      <w:r>
-        <w:rPr>
-          <w:rFonts w:ascii="Impact" w:hAnsi="Impact" w:cs="Impact" w:eastAsia="Impact"/>
-          <w:sz w:val="32"/>
-          <w:szCs w:val="32"/>
+        <w:rPr>
+          <w:sz w:val="30"/>
+          <w:szCs w:val="30"/>
+        </w:rPr>
+      </w:pPr>
+      <w:r>
+        <w:rPr>
+          <w:rFonts w:ascii="Impact" w:eastAsia="Impact" w:hAnsi="Impact" w:cs="Impact"/>
           <w:b/>
           <w:w w:val="90"/>
+          <w:sz w:val="30"/>
+          <w:szCs w:val="30"/>
           <w:u w:val="single"/>
         </w:rPr>
-        <w:t xml:space="preserve">OFICIO N.º ${oficio_numero}-${oficio_anio}-COMOPPOL-DIRNOS-PNP/DIRTTSV-DIVPIAT-UIAT-NORTE</w:t>
+        <w:t>OFICIO N.º ${oficio_numero}-${oficio_anio}-COMOPPOL-DIRNOS-PNP/DIRTTSV-DIVPIAT-UIAT-NORTE</w:t>
       </w:r>
     </w:p>
     <w:p>
@@ -118,27 +125,38 @@
     </w:p>
     <w:p>
       <w:pPr>
-        <w:pStyle w:val="Normal"/>
         <w:keepNext/>
-        <w:spacing w:before="0" w:after="0"/>
-        <w:jc w:val="left"/>
-        <w:ind w:left="1560" w:hanging="1560" w:right="0"/>
         <w:tabs>
           <w:tab w:val="left" w:pos="1418"/>
           <w:tab w:val="left" w:pos="1560"/>
         </w:tabs>
-      </w:pPr>
-      <w:r>
-        <w:rPr>
-          <w:rFonts w:ascii="Arial" w:hAnsi="Arial" w:cs="Arial" w:eastAsia="Arial"/>
+        <w:ind w:left="1560" w:hanging="1560"/>
+      </w:pPr>
+      <w:r>
+        <w:rPr>
+          <w:rFonts w:ascii="Arial" w:eastAsia="Arial" w:hAnsi="Arial" w:cs="Arial"/>
           <w:sz w:val="24"/>
           <w:szCs w:val="24"/>
         </w:rPr>
-        <w:t xml:space="preserve">SEÑOR</w:t>
-        <w:tab/>
-        <w:t xml:space="preserve">:</w:t>
-        <w:tab/>
-        <w:t xml:space="preserve">${entidad_nombre}</w:t>
+        <w:t>SEÑOR</w:t>
+      </w:r>
+      <w:r>
+        <w:rPr>
+          <w:rFonts w:ascii="Arial" w:eastAsia="Arial" w:hAnsi="Arial" w:cs="Arial"/>
+          <w:sz w:val="24"/>
+          <w:szCs w:val="24"/>
+        </w:rPr>
+        <w:tab/>
+        <w:t>:</w:t>
+      </w:r>
+      <w:r>
+        <w:rPr>
+          <w:rFonts w:ascii="Arial" w:eastAsia="Arial" w:hAnsi="Arial" w:cs="Arial"/>
+          <w:sz w:val="24"/>
+          <w:szCs w:val="24"/>
+        </w:rPr>
+        <w:tab/>
+        <w:t>${entidad_nombre}</w:t>
       </w:r>
     </w:p>
     <w:p>
@@ -164,27 +182,38 @@
     </w:p>
     <w:p>
       <w:pPr>
-        <w:pStyle w:val="Normal"/>
         <w:keepNext/>
-        <w:spacing w:before="0" w:after="0"/>
-        <w:jc w:val="left"/>
-        <w:ind w:left="1560" w:hanging="1560" w:right="0"/>
         <w:tabs>
           <w:tab w:val="left" w:pos="1418"/>
           <w:tab w:val="left" w:pos="1560"/>
         </w:tabs>
-      </w:pPr>
-      <w:r>
-        <w:rPr>
-          <w:rFonts w:ascii="Arial" w:hAnsi="Arial" w:cs="Arial" w:eastAsia="Arial"/>
+        <w:ind w:left="1560" w:hanging="1560"/>
+      </w:pPr>
+      <w:r>
+        <w:rPr>
+          <w:rFonts w:ascii="Arial" w:eastAsia="Arial" w:hAnsi="Arial" w:cs="Arial"/>
           <w:sz w:val="24"/>
           <w:szCs w:val="24"/>
         </w:rPr>
-        <w:t xml:space="preserve">ASUNTO</w:t>
-        <w:tab/>
-        <w:t xml:space="preserve">:</w:t>
-        <w:tab/>
-        <w:t xml:space="preserve">${motivo}</w:t>
+        <w:t>ASUNTO</w:t>
+      </w:r>
+      <w:r>
+        <w:rPr>
+          <w:rFonts w:ascii="Arial" w:eastAsia="Arial" w:hAnsi="Arial" w:cs="Arial"/>
+          <w:sz w:val="24"/>
+          <w:szCs w:val="24"/>
+        </w:rPr>
+        <w:tab/>
+        <w:t>:</w:t>
+      </w:r>
+      <w:r>
+        <w:rPr>
+          <w:rFonts w:ascii="Arial" w:eastAsia="Arial" w:hAnsi="Arial" w:cs="Arial"/>
+          <w:sz w:val="24"/>
+          <w:szCs w:val="24"/>
+        </w:rPr>
+        <w:tab/>
+        <w:t>${motivo}</w:t>
       </w:r>
     </w:p>
     <w:p>
@@ -267,11 +296,21 @@
         <w:rPr>
           <w:rFonts w:ascii="Arial" w:hAnsi="Arial"/>
         </w:rPr>
-        <w:t xml:space="preserve">NOMBRES</w:t>
-        <w:tab/>
-        <w:t xml:space="preserve">:</w:t>
-        <w:tab/>
-        <w:t xml:space="preserve">${fallecido_nombres}</w:t>
+        <w:t>NOMBRES</w:t>
+      </w:r>
+      <w:r>
+        <w:rPr>
+          <w:rFonts w:ascii="Arial" w:hAnsi="Arial"/>
+        </w:rPr>
+        <w:tab/>
+        <w:t>:</w:t>
+      </w:r>
+      <w:r>
+        <w:rPr>
+          <w:rFonts w:ascii="Arial" w:hAnsi="Arial"/>
+        </w:rPr>
+        <w:tab/>
+        <w:t>${fallecido_nombres}</w:t>
       </w:r>
     </w:p>
     <w:p>
@@ -293,11 +332,21 @@
         <w:rPr>
           <w:rFonts w:ascii="Arial" w:hAnsi="Arial"/>
         </w:rPr>
-        <w:t xml:space="preserve">APELLIDOS</w:t>
-        <w:tab/>
-        <w:t xml:space="preserve">:</w:t>
-        <w:tab/>
-        <w:t xml:space="preserve">${fallecido_apellidos}</w:t>
+        <w:t>APELLIDOS</w:t>
+      </w:r>
+      <w:r>
+        <w:rPr>
+          <w:rFonts w:ascii="Arial" w:hAnsi="Arial"/>
+        </w:rPr>
+        <w:tab/>
+        <w:t>:</w:t>
+      </w:r>
+      <w:r>
+        <w:rPr>
+          <w:rFonts w:ascii="Arial" w:hAnsi="Arial"/>
+        </w:rPr>
+        <w:tab/>
+        <w:t>${fallecido_apellidos}</w:t>
       </w:r>
     </w:p>
     <w:p>
@@ -319,11 +368,21 @@
         <w:rPr>
           <w:rFonts w:ascii="Arial" w:hAnsi="Arial"/>
         </w:rPr>
-        <w:t xml:space="preserve">EDAD</w:t>
-        <w:tab/>
-        <w:t xml:space="preserve">:</w:t>
-        <w:tab/>
-        <w:t xml:space="preserve">${fallecido_edad}</w:t>
+        <w:t>EDAD</w:t>
+      </w:r>
+      <w:r>
+        <w:rPr>
+          <w:rFonts w:ascii="Arial" w:hAnsi="Arial"/>
+        </w:rPr>
+        <w:tab/>
+        <w:t>:</w:t>
+      </w:r>
+      <w:r>
+        <w:rPr>
+          <w:rFonts w:ascii="Arial" w:hAnsi="Arial"/>
+        </w:rPr>
+        <w:tab/>
+        <w:t>${fallecido_edad}</w:t>
       </w:r>
     </w:p>
     <w:p>
@@ -345,11 +404,21 @@
         <w:rPr>
           <w:rFonts w:ascii="Arial" w:hAnsi="Arial"/>
         </w:rPr>
-        <w:t xml:space="preserve">SEXO</w:t>
-        <w:tab/>
-        <w:t xml:space="preserve">:</w:t>
-        <w:tab/>
-        <w:t xml:space="preserve">${fallecido_sexo}</w:t>
+        <w:t>SEXO</w:t>
+      </w:r>
+      <w:r>
+        <w:rPr>
+          <w:rFonts w:ascii="Arial" w:hAnsi="Arial"/>
+        </w:rPr>
+        <w:tab/>
+        <w:t>:</w:t>
+      </w:r>
+      <w:r>
+        <w:rPr>
+          <w:rFonts w:ascii="Arial" w:hAnsi="Arial"/>
+        </w:rPr>
+        <w:tab/>
+        <w:t>${fallecido_sexo}</w:t>
       </w:r>
     </w:p>
     <w:p>
@@ -371,11 +440,21 @@
         <w:rPr>
           <w:rFonts w:ascii="Arial" w:hAnsi="Arial"/>
         </w:rPr>
-        <w:t xml:space="preserve">LUGAR DE NACIMIENTO</w:t>
-        <w:tab/>
-        <w:t xml:space="preserve">:</w:t>
-        <w:tab/>
-        <w:t xml:space="preserve">${fallecido_nacimiento_lugar}</w:t>
+        <w:t>LUGAR DE NACIMIENTO</w:t>
+      </w:r>
+      <w:r>
+        <w:rPr>
+          <w:rFonts w:ascii="Arial" w:hAnsi="Arial"/>
+        </w:rPr>
+        <w:tab/>
+        <w:t>:</w:t>
+      </w:r>
+      <w:r>
+        <w:rPr>
+          <w:rFonts w:ascii="Arial" w:hAnsi="Arial"/>
+        </w:rPr>
+        <w:tab/>
+        <w:t>${fallecido_nacimiento_lugar}</w:t>
       </w:r>
     </w:p>
     <w:p>
@@ -397,11 +476,21 @@
         <w:rPr>
           <w:rFonts w:ascii="Arial" w:hAnsi="Arial"/>
         </w:rPr>
-        <w:t xml:space="preserve">NACIONALIDAD</w:t>
-        <w:tab/>
-        <w:t xml:space="preserve">:</w:t>
-        <w:tab/>
-        <w:t xml:space="preserve">${fallecido_nacionalidad}</w:t>
+        <w:t>NACIONALIDAD</w:t>
+      </w:r>
+      <w:r>
+        <w:rPr>
+          <w:rFonts w:ascii="Arial" w:hAnsi="Arial"/>
+        </w:rPr>
+        <w:tab/>
+        <w:t>:</w:t>
+      </w:r>
+      <w:r>
+        <w:rPr>
+          <w:rFonts w:ascii="Arial" w:hAnsi="Arial"/>
+        </w:rPr>
+        <w:tab/>
+        <w:t>${fallecido_nacionalidad}</w:t>
       </w:r>
     </w:p>
     <w:p>
@@ -423,11 +512,21 @@
         <w:rPr>
           <w:rFonts w:ascii="Arial" w:hAnsi="Arial"/>
         </w:rPr>
-        <w:t xml:space="preserve">FECHA DE NACIMIENTO</w:t>
-        <w:tab/>
-        <w:t xml:space="preserve">:</w:t>
-        <w:tab/>
-        <w:t xml:space="preserve">${fallecido_nacimiento_fecha}</w:t>
+        <w:t>FECHA DE NACIMIENTO</w:t>
+      </w:r>
+      <w:r>
+        <w:rPr>
+          <w:rFonts w:ascii="Arial" w:hAnsi="Arial"/>
+        </w:rPr>
+        <w:tab/>
+        <w:t>:</w:t>
+      </w:r>
+      <w:r>
+        <w:rPr>
+          <w:rFonts w:ascii="Arial" w:hAnsi="Arial"/>
+        </w:rPr>
+        <w:tab/>
+        <w:t>${fallecido_nacimiento_fecha}</w:t>
       </w:r>
     </w:p>
     <w:p>
@@ -449,11 +548,21 @@
         <w:rPr>
           <w:rFonts w:ascii="Arial" w:hAnsi="Arial"/>
         </w:rPr>
-        <w:t xml:space="preserve">DOCUMENTOS DE IDENTIDAD</w:t>
-        <w:tab/>
-        <w:t xml:space="preserve">:</w:t>
-        <w:tab/>
-        <w:t xml:space="preserve">${fallecido_documento}</w:t>
+        <w:t>DOCUMENTOS DE IDENTIDAD</w:t>
+      </w:r>
+      <w:r>
+        <w:rPr>
+          <w:rFonts w:ascii="Arial" w:hAnsi="Arial"/>
+        </w:rPr>
+        <w:tab/>
+        <w:t>:</w:t>
+      </w:r>
+      <w:r>
+        <w:rPr>
+          <w:rFonts w:ascii="Arial" w:hAnsi="Arial"/>
+        </w:rPr>
+        <w:tab/>
+        <w:t>${fallecido_documento}</w:t>
       </w:r>
     </w:p>
     <w:p>
@@ -475,11 +584,21 @@
         <w:rPr>
           <w:rFonts w:ascii="Arial" w:hAnsi="Arial"/>
         </w:rPr>
-        <w:t xml:space="preserve">ESTADO CIVIL</w:t>
-        <w:tab/>
-        <w:t xml:space="preserve">:</w:t>
-        <w:tab/>
-        <w:t xml:space="preserve">${fallecido_estado_civil}</w:t>
+        <w:t>ESTADO CIVIL</w:t>
+      </w:r>
+      <w:r>
+        <w:rPr>
+          <w:rFonts w:ascii="Arial" w:hAnsi="Arial"/>
+        </w:rPr>
+        <w:tab/>
+        <w:t>:</w:t>
+      </w:r>
+      <w:r>
+        <w:rPr>
+          <w:rFonts w:ascii="Arial" w:hAnsi="Arial"/>
+        </w:rPr>
+        <w:tab/>
+        <w:t>${fallecido_estado_civil}</w:t>
       </w:r>
     </w:p>
     <w:p>
@@ -501,11 +620,21 @@
         <w:rPr>
           <w:rFonts w:ascii="Arial" w:hAnsi="Arial"/>
         </w:rPr>
-        <w:t xml:space="preserve">NOMBRE DEL PADRE</w:t>
-        <w:tab/>
-        <w:t xml:space="preserve">:</w:t>
-        <w:tab/>
-        <w:t xml:space="preserve">${nombre_padre}</w:t>
+        <w:t>NOMBRE DEL PADRE</w:t>
+      </w:r>
+      <w:r>
+        <w:rPr>
+          <w:rFonts w:ascii="Arial" w:hAnsi="Arial"/>
+        </w:rPr>
+        <w:tab/>
+        <w:t>:</w:t>
+      </w:r>
+      <w:r>
+        <w:rPr>
+          <w:rFonts w:ascii="Arial" w:hAnsi="Arial"/>
+        </w:rPr>
+        <w:tab/>
+        <w:t>${nombre_padre}</w:t>
       </w:r>
     </w:p>
     <w:p>
@@ -527,11 +656,21 @@
         <w:rPr>
           <w:rFonts w:ascii="Arial" w:hAnsi="Arial"/>
         </w:rPr>
-        <w:t xml:space="preserve">NOMBRE DE LA MADRE</w:t>
-        <w:tab/>
-        <w:t xml:space="preserve">:</w:t>
-        <w:tab/>
-        <w:t xml:space="preserve">${nombre_madre}</w:t>
+        <w:t>NOMBRE DE LA MADRE</w:t>
+      </w:r>
+      <w:r>
+        <w:rPr>
+          <w:rFonts w:ascii="Arial" w:hAnsi="Arial"/>
+        </w:rPr>
+        <w:tab/>
+        <w:t>:</w:t>
+      </w:r>
+      <w:r>
+        <w:rPr>
+          <w:rFonts w:ascii="Arial" w:hAnsi="Arial"/>
+        </w:rPr>
+        <w:tab/>
+        <w:t>${nombre_madre}</w:t>
       </w:r>
     </w:p>
     <w:p>
@@ -553,11 +692,21 @@
         <w:rPr>
           <w:rFonts w:ascii="Arial" w:hAnsi="Arial"/>
         </w:rPr>
-        <w:t xml:space="preserve">LUGAR DEL FALLECIMIENTO</w:t>
-        <w:tab/>
-        <w:t xml:space="preserve">:</w:t>
-        <w:tab/>
-        <w:t xml:space="preserve">${lugar_fallecimiento}</w:t>
+        <w:t>LUGAR DEL FALLECIMIENTO</w:t>
+      </w:r>
+      <w:r>
+        <w:rPr>
+          <w:rFonts w:ascii="Arial" w:hAnsi="Arial"/>
+        </w:rPr>
+        <w:tab/>
+        <w:t>:</w:t>
+      </w:r>
+      <w:r>
+        <w:rPr>
+          <w:rFonts w:ascii="Arial" w:hAnsi="Arial"/>
+        </w:rPr>
+        <w:tab/>
+        <w:t>${lugar_fallecimiento}</w:t>
       </w:r>
     </w:p>
     <w:p>
@@ -579,11 +728,21 @@
         <w:rPr>
           <w:rFonts w:ascii="Arial" w:hAnsi="Arial"/>
         </w:rPr>
-        <w:t xml:space="preserve">FECHA DEL FALLECIMIENTO</w:t>
-        <w:tab/>
-        <w:t xml:space="preserve">:</w:t>
-        <w:tab/>
-        <w:t xml:space="preserve">${fecha_fallecimiento}</w:t>
+        <w:t>FECHA DEL FALLECIMIENTO</w:t>
+      </w:r>
+      <w:r>
+        <w:rPr>
+          <w:rFonts w:ascii="Arial" w:hAnsi="Arial"/>
+        </w:rPr>
+        <w:tab/>
+        <w:t>:</w:t>
+      </w:r>
+      <w:r>
+        <w:rPr>
+          <w:rFonts w:ascii="Arial" w:hAnsi="Arial"/>
+        </w:rPr>
+        <w:tab/>
+        <w:t>${fecha_fallecimiento}</w:t>
       </w:r>
     </w:p>
     <w:p>
@@ -605,11 +764,21 @@
         <w:rPr>
           <w:rFonts w:ascii="Arial" w:hAnsi="Arial"/>
         </w:rPr>
-        <w:t xml:space="preserve">HORA   DEL FALLECIMIENTO</w:t>
-        <w:tab/>
-        <w:t xml:space="preserve">:</w:t>
-        <w:tab/>
-        <w:t xml:space="preserve">${hora_fallecimiento}</w:t>
+        <w:t>HORA   DEL FALLECIMIENTO</w:t>
+      </w:r>
+      <w:r>
+        <w:rPr>
+          <w:rFonts w:ascii="Arial" w:hAnsi="Arial"/>
+        </w:rPr>
+        <w:tab/>
+        <w:t>:</w:t>
+      </w:r>
+      <w:r>
+        <w:rPr>
+          <w:rFonts w:ascii="Arial" w:hAnsi="Arial"/>
+        </w:rPr>
+        <w:tab/>
+        <w:t>${hora_fallecimiento}</w:t>
       </w:r>
     </w:p>
     <w:p>
@@ -632,11 +801,21 @@
         <w:rPr>
           <w:rFonts w:ascii="Arial" w:hAnsi="Arial"/>
         </w:rPr>
-        <w:t xml:space="preserve">CAUSA DE LA MUERTE</w:t>
-        <w:tab/>
-        <w:t xml:space="preserve">:</w:t>
-        <w:tab/>
-        <w:t xml:space="preserve">${causa_muerte}</w:t>
+        <w:t>CAUSA DE LA MUERTE</w:t>
+      </w:r>
+      <w:r>
+        <w:rPr>
+          <w:rFonts w:ascii="Arial" w:hAnsi="Arial"/>
+        </w:rPr>
+        <w:tab/>
+        <w:t>:</w:t>
+      </w:r>
+      <w:r>
+        <w:rPr>
+          <w:rFonts w:ascii="Arial" w:hAnsi="Arial"/>
+        </w:rPr>
+        <w:tab/>
+        <w:t>${causa_muerte}</w:t>
       </w:r>
     </w:p>
     <w:p>
@@ -659,11 +838,21 @@
         <w:rPr>
           <w:rFonts w:ascii="Arial" w:hAnsi="Arial"/>
         </w:rPr>
-        <w:t xml:space="preserve">AGENTE CAUSANTE</w:t>
-        <w:tab/>
-        <w:t xml:space="preserve">:</w:t>
-        <w:tab/>
-        <w:t xml:space="preserve">${agente_causante}</w:t>
+        <w:t>AGENTE CAUSANTE</w:t>
+      </w:r>
+      <w:r>
+        <w:rPr>
+          <w:rFonts w:ascii="Arial" w:hAnsi="Arial"/>
+        </w:rPr>
+        <w:tab/>
+        <w:t>:</w:t>
+      </w:r>
+      <w:r>
+        <w:rPr>
+          <w:rFonts w:ascii="Arial" w:hAnsi="Arial"/>
+        </w:rPr>
+        <w:tab/>
+        <w:t>${agente_causante}</w:t>
       </w:r>
     </w:p>
     <w:p>
@@ -701,7 +890,7 @@
           <w:sz w:val="24"/>
           <w:szCs w:val="24"/>
         </w:rPr>
-        <w:t xml:space="preserve">${adjuntos}</w:t>
+        <w:t>${adjuntos}</w:t>
       </w:r>
     </w:p>
     <w:p>
@@ -764,6 +953,523 @@
       </w:pPr>
       <w:r>
         <w:rPr>
+          <w:noProof/>
+          <w:szCs w:val="24"/>
+          <w:lang w:eastAsia="es-PE"/>
+        </w:rPr>
+        <mc:AlternateContent>
+          <mc:Choice Requires="wpg">
+            <w:drawing>
+              <wp:anchor distT="0" distB="0" distL="114300" distR="114300" simplePos="0" relativeHeight="251661312" behindDoc="0" locked="0" layoutInCell="1" allowOverlap="1" wp14:anchorId="1F4D8F7D" wp14:editId="7908ABE6">
+                <wp:simplePos x="0" y="0"/>
+                <wp:positionH relativeFrom="margin">
+                  <wp:posOffset>2245065</wp:posOffset>
+                </wp:positionH>
+                <wp:positionV relativeFrom="paragraph">
+                  <wp:posOffset>134620</wp:posOffset>
+                </wp:positionV>
+                <wp:extent cx="1183640" cy="1315085"/>
+                <wp:effectExtent l="0" t="0" r="0" b="0"/>
+                <wp:wrapNone/>
+                <wp:docPr id="1240658375" name="Grupo 1240658375"/>
+                <wp:cNvGraphicFramePr/>
+                <a:graphic xmlns:a="http://schemas.openxmlformats.org/drawingml/2006/main">
+                  <a:graphicData uri="http://schemas.microsoft.com/office/word/2010/wordprocessingGroup">
+                    <wpg:wgp>
+                      <wpg:cNvGrpSpPr/>
+                      <wpg:grpSpPr>
+                        <a:xfrm>
+                          <a:off x="0" y="0"/>
+                          <a:ext cx="1183640" cy="1315085"/>
+                          <a:chOff x="0" y="408"/>
+                          <a:chExt cx="1183658" cy="1315694"/>
+                        </a:xfrm>
+                      </wpg:grpSpPr>
+                      <wpg:grpSp>
+                        <wpg:cNvPr id="427205304" name="Grupo 427205304"/>
+                        <wpg:cNvGrpSpPr/>
+                        <wpg:grpSpPr>
+                          <a:xfrm>
+                            <a:off x="0" y="408"/>
+                            <a:ext cx="1183658" cy="1315694"/>
+                            <a:chOff x="0" y="408"/>
+                            <a:chExt cx="1183658" cy="1315694"/>
+                          </a:xfrm>
+                        </wpg:grpSpPr>
+                        <wps:wsp>
+                          <wps:cNvPr id="663416818" name="Cuadro de texto 663416818"/>
+                          <wps:cNvSpPr txBox="1"/>
+                          <wps:spPr>
+                            <a:xfrm>
+                              <a:off x="0" y="408"/>
+                              <a:ext cx="1183658" cy="1315694"/>
+                            </a:xfrm>
+                            <a:prstGeom prst="rect">
+                              <a:avLst/>
+                            </a:prstGeom>
+                            <a:noFill/>
+                            <a:ln>
+                              <a:noFill/>
+                            </a:ln>
+                          </wps:spPr>
+                          <wps:txbx>
+                            <w:txbxContent>
+                              <w:p>
+                                <w:pPr>
+                                  <w:rPr>
+                                    <w:rFonts w:ascii="Arial" w:hAnsi="Arial" w:cs="Arial"/>
+                                    <w:noProof/>
+                                    <w:sz w:val="18"/>
+                                    <w:szCs w:val="18"/>
+                                  </w:rPr>
+                                </w:pPr>
+                                <w:r>
+                                  <w:rPr>
+                                    <w:rFonts w:ascii="Arial" w:hAnsi="Arial" w:cs="Arial"/>
+                                    <w:noProof/>
+                                    <w:sz w:val="18"/>
+                                    <w:szCs w:val="18"/>
+                                  </w:rPr>
+                                  <w:sym w:font="Symbol" w:char="F0B7"/>
+                                </w:r>
+                                <w:r>
+                                  <w:rPr>
+                                    <w:rFonts w:ascii="Arial" w:hAnsi="Arial" w:cs="Arial"/>
+                                    <w:noProof/>
+                                    <w:sz w:val="18"/>
+                                    <w:szCs w:val="18"/>
+                                  </w:rPr>
+                                  <w:t xml:space="preserve"> POLICÍA NACIONAL DEL PERÚ </w:t>
+                                </w:r>
+                                <w:r>
+                                  <w:rPr>
+                                    <w:rFonts w:ascii="Arial" w:hAnsi="Arial" w:cs="Arial"/>
+                                    <w:noProof/>
+                                    <w:sz w:val="18"/>
+                                    <w:szCs w:val="18"/>
+                                  </w:rPr>
+                                  <w:sym w:font="Symbol" w:char="F0B7"/>
+                                </w:r>
+                              </w:p>
+                            </w:txbxContent>
+                          </wps:txbx>
+                          <wps:bodyPr rot="0" spcFirstLastPara="1" vertOverflow="overflow" horzOverflow="overflow" vert="horz" wrap="square" lIns="91440" tIns="45720" rIns="91440" bIns="45720" numCol="1" spcCol="0" rtlCol="0" fromWordArt="0" anchor="ctr" anchorCtr="0" forceAA="0" compatLnSpc="1">
+                            <a:prstTxWarp prst="textArchUp">
+                              <a:avLst/>
+                            </a:prstTxWarp>
+                            <a:noAutofit/>
+                          </wps:bodyPr>
+                        </wps:wsp>
+                        <wpg:grpSp>
+                          <wpg:cNvPr id="1179899979" name="Grupo 1179899979"/>
+                          <wpg:cNvGrpSpPr/>
+                          <wpg:grpSpPr>
+                            <a:xfrm>
+                              <a:off x="58141" y="15857"/>
+                              <a:ext cx="1058545" cy="1062647"/>
+                              <a:chOff x="0" y="0"/>
+                              <a:chExt cx="1058545" cy="1062647"/>
+                            </a:xfrm>
+                          </wpg:grpSpPr>
+                          <pic:pic xmlns:pic="http://schemas.openxmlformats.org/drawingml/2006/picture">
+                            <pic:nvPicPr>
+                              <pic:cNvPr id="465575216" name="Imagen 465575216" descr="selloestado[1]"/>
+                              <pic:cNvPicPr>
+                                <a:picLocks noChangeAspect="1"/>
+                              </pic:cNvPicPr>
+                            </pic:nvPicPr>
+                            <pic:blipFill>
+                              <a:blip r:embed="rId7" cstate="print">
+                                <a:extLst>
+                                  <a:ext uri="{28A0092B-C50C-407E-A947-70E740481C1C}">
+                                    <a14:useLocalDpi xmlns:a14="http://schemas.microsoft.com/office/drawing/2010/main" val="0"/>
+                                  </a:ext>
+                                </a:extLst>
+                              </a:blip>
+                              <a:srcRect/>
+                              <a:stretch>
+                                <a:fillRect/>
+                              </a:stretch>
+                            </pic:blipFill>
+                            <pic:spPr bwMode="auto">
+                              <a:xfrm>
+                                <a:off x="328920" y="282872"/>
+                                <a:ext cx="396875" cy="514350"/>
+                              </a:xfrm>
+                              <a:prstGeom prst="rect">
+                                <a:avLst/>
+                              </a:prstGeom>
+                              <a:noFill/>
+                              <a:ln>
+                                <a:noFill/>
+                              </a:ln>
+                            </pic:spPr>
+                          </pic:pic>
+                          <wpg:grpSp>
+                            <wpg:cNvPr id="1249872960" name="Grupo 1249872960"/>
+                            <wpg:cNvGrpSpPr/>
+                            <wpg:grpSpPr>
+                              <a:xfrm>
+                                <a:off x="0" y="0"/>
+                                <a:ext cx="1058545" cy="1062647"/>
+                                <a:chOff x="0" y="0"/>
+                                <a:chExt cx="1058545" cy="1062647"/>
+                              </a:xfrm>
+                            </wpg:grpSpPr>
+                            <wps:wsp>
+                              <wps:cNvPr id="1958472695" name="Elipse 1958472695"/>
+                              <wps:cNvSpPr/>
+                              <wps:spPr>
+                                <a:xfrm>
+                                  <a:off x="0" y="0"/>
+                                  <a:ext cx="1058545" cy="1062647"/>
+                                </a:xfrm>
+                                <a:prstGeom prst="ellipse">
+                                  <a:avLst/>
+                                </a:prstGeom>
+                                <a:noFill/>
+                                <a:ln w="9525">
+                                  <a:solidFill>
+                                    <a:schemeClr val="tx1"/>
+                                  </a:solidFill>
+                                </a:ln>
+                              </wps:spPr>
+                              <wps:style>
+                                <a:lnRef idx="2">
+                                  <a:schemeClr val="accent1">
+                                    <a:shade val="50000"/>
+                                  </a:schemeClr>
+                                </a:lnRef>
+                                <a:fillRef idx="1">
+                                  <a:schemeClr val="accent1"/>
+                                </a:fillRef>
+                                <a:effectRef idx="0">
+                                  <a:schemeClr val="accent1"/>
+                                </a:effectRef>
+                                <a:fontRef idx="minor">
+                                  <a:schemeClr val="lt1"/>
+                                </a:fontRef>
+                              </wps:style>
+                              <wps:bodyPr rot="0" spcFirstLastPara="0" vertOverflow="overflow" horzOverflow="overflow" vert="horz" wrap="square" lIns="91440" tIns="45720" rIns="91440" bIns="45720" numCol="1" spcCol="0" rtlCol="0" fromWordArt="0" anchor="ctr" anchorCtr="0" forceAA="0" compatLnSpc="1">
+                                <a:prstTxWarp prst="textNoShape">
+                                  <a:avLst/>
+                                </a:prstTxWarp>
+                                <a:noAutofit/>
+                              </wps:bodyPr>
+                            </wps:wsp>
+                            <wps:wsp>
+                              <wps:cNvPr id="420179845" name="Elipse 420179845"/>
+                              <wps:cNvSpPr/>
+                              <wps:spPr>
+                                <a:xfrm>
+                                  <a:off x="184196" y="197564"/>
+                                  <a:ext cx="693763" cy="687232"/>
+                                </a:xfrm>
+                                <a:prstGeom prst="ellipse">
+                                  <a:avLst/>
+                                </a:prstGeom>
+                                <a:noFill/>
+                                <a:ln w="19050" cmpd="thickThin">
+                                  <a:solidFill>
+                                    <a:schemeClr val="tx1"/>
+                                  </a:solidFill>
+                                </a:ln>
+                              </wps:spPr>
+                              <wps:style>
+                                <a:lnRef idx="2">
+                                  <a:schemeClr val="accent1">
+                                    <a:shade val="50000"/>
+                                  </a:schemeClr>
+                                </a:lnRef>
+                                <a:fillRef idx="1">
+                                  <a:schemeClr val="accent1"/>
+                                </a:fillRef>
+                                <a:effectRef idx="0">
+                                  <a:schemeClr val="accent1"/>
+                                </a:effectRef>
+                                <a:fontRef idx="minor">
+                                  <a:schemeClr val="lt1"/>
+                                </a:fontRef>
+                              </wps:style>
+                              <wps:bodyPr rot="0" spcFirstLastPara="0" vertOverflow="overflow" horzOverflow="overflow" vert="horz" wrap="square" lIns="91440" tIns="45720" rIns="91440" bIns="45720" numCol="1" spcCol="0" rtlCol="0" fromWordArt="0" anchor="ctr" anchorCtr="0" forceAA="0" compatLnSpc="1">
+                                <a:prstTxWarp prst="textNoShape">
+                                  <a:avLst/>
+                                </a:prstTxWarp>
+                                <a:noAutofit/>
+                              </wps:bodyPr>
+                            </wps:wsp>
+                            <wps:wsp>
+                              <wps:cNvPr id="779749789" name="Elipse 779749789"/>
+                              <wps:cNvSpPr/>
+                              <wps:spPr>
+                                <a:xfrm>
+                                  <a:off x="29603" y="29914"/>
+                                  <a:ext cx="1003208" cy="1009475"/>
+                                </a:xfrm>
+                                <a:prstGeom prst="ellipse">
+                                  <a:avLst/>
+                                </a:prstGeom>
+                                <a:noFill/>
+                                <a:ln w="6350">
+                                  <a:solidFill>
+                                    <a:schemeClr val="tx1"/>
+                                  </a:solidFill>
+                                </a:ln>
+                              </wps:spPr>
+                              <wps:style>
+                                <a:lnRef idx="2">
+                                  <a:schemeClr val="accent1">
+                                    <a:shade val="50000"/>
+                                  </a:schemeClr>
+                                </a:lnRef>
+                                <a:fillRef idx="1">
+                                  <a:schemeClr val="accent1"/>
+                                </a:fillRef>
+                                <a:effectRef idx="0">
+                                  <a:schemeClr val="accent1"/>
+                                </a:effectRef>
+                                <a:fontRef idx="minor">
+                                  <a:schemeClr val="lt1"/>
+                                </a:fontRef>
+                              </wps:style>
+                              <wps:bodyPr rot="0" spcFirstLastPara="0" vertOverflow="overflow" horzOverflow="overflow" vert="horz" wrap="square" lIns="91440" tIns="45720" rIns="91440" bIns="45720" numCol="1" spcCol="0" rtlCol="0" fromWordArt="0" anchor="ctr" anchorCtr="0" forceAA="0" compatLnSpc="1">
+                                <a:prstTxWarp prst="textNoShape">
+                                  <a:avLst/>
+                                </a:prstTxWarp>
+                                <a:noAutofit/>
+                              </wps:bodyPr>
+                            </wps:wsp>
+                          </wpg:grpSp>
+                        </wpg:grpSp>
+                      </wpg:grpSp>
+                      <wps:wsp>
+                        <wps:cNvPr id="752435379" name="Cuadro de texto 752435379"/>
+                        <wps:cNvSpPr txBox="1"/>
+                        <wps:spPr>
+                          <a:xfrm>
+                            <a:off x="86008" y="339505"/>
+                            <a:ext cx="1004934" cy="769903"/>
+                          </a:xfrm>
+                          <a:prstGeom prst="rect">
+                            <a:avLst/>
+                          </a:prstGeom>
+                          <a:noFill/>
+                          <a:ln>
+                            <a:noFill/>
+                          </a:ln>
+                        </wps:spPr>
+                        <wps:txbx>
+                          <w:txbxContent>
+                            <w:p>
+                              <w:pPr>
+                                <w:jc w:val="center"/>
+                                <w:rPr>
+                                  <w:rFonts w:ascii="Arial" w:hAnsi="Arial" w:cs="Arial"/>
+                                  <w:noProof/>
+                                  <w:color w:val="000000" w:themeColor="text1"/>
+                                  <w:sz w:val="18"/>
+                                  <w:szCs w:val="14"/>
+                                  <w14:textOutline w14:w="0" w14:cap="flat" w14:cmpd="sng" w14:algn="ctr">
+                                    <w14:noFill/>
+                                    <w14:prstDash w14:val="solid"/>
+                                    <w14:round/>
+                                  </w14:textOutline>
+                                </w:rPr>
+                              </w:pPr>
+                              <w:r>
+                                <w:rPr>
+                                  <w:rFonts w:ascii="Arial" w:hAnsi="Arial" w:cs="Arial"/>
+                                  <w:noProof/>
+                                  <w:color w:val="000000" w:themeColor="text1"/>
+                                  <w:sz w:val="18"/>
+                                  <w:szCs w:val="14"/>
+                                  <w14:textOutline w14:w="0" w14:cap="flat" w14:cmpd="sng" w14:algn="ctr">
+                                    <w14:noFill/>
+                                    <w14:prstDash w14:val="solid"/>
+                                    <w14:round/>
+                                  </w14:textOutline>
+                                </w:rPr>
+                                <w:t>DEP</w:t>
+                              </w:r>
+                              <w:r>
+                                <w:rPr>
+                                  <w:rFonts w:ascii="Arial" w:hAnsi="Arial" w:cs="Arial"/>
+                                  <w:noProof/>
+                                  <w:color w:val="000000" w:themeColor="text1"/>
+                                  <w:sz w:val="18"/>
+                                  <w:szCs w:val="14"/>
+                                  <w14:textOutline w14:w="0" w14:cap="flat" w14:cmpd="sng" w14:algn="ctr">
+                                    <w14:noFill/>
+                                    <w14:prstDash w14:val="solid"/>
+                                    <w14:round/>
+                                  </w14:textOutline>
+                                </w:rPr>
+                                <w:t>IAT - NORTE</w:t>
+                              </w:r>
+                            </w:p>
+                          </w:txbxContent>
+                        </wps:txbx>
+                        <wps:bodyPr rot="0" spcFirstLastPara="1" vertOverflow="overflow" horzOverflow="overflow" vert="horz" wrap="square" lIns="91440" tIns="45720" rIns="91440" bIns="45720" numCol="1" spcCol="0" rtlCol="0" fromWordArt="0" anchor="ctr" anchorCtr="0" forceAA="0" compatLnSpc="1">
+                          <a:prstTxWarp prst="textArchDown">
+                            <a:avLst/>
+                          </a:prstTxWarp>
+                          <a:noAutofit/>
+                        </wps:bodyPr>
+                      </wps:wsp>
+                    </wpg:wgp>
+                  </a:graphicData>
+                </a:graphic>
+              </wp:anchor>
+            </w:drawing>
+          </mc:Choice>
+          <mc:Fallback>
+            <w:pict>
+              <v:group w14:anchorId="1F4D8F7D" id="Grupo 1240658375" o:spid="_x0000_s1026" style="position:absolute;left:0;text-align:left;margin-left:176.8pt;margin-top:10.6pt;width:93.2pt;height:103.55pt;z-index:251661312;mso-position-horizontal-relative:margin" coordorigin=",4" coordsize="11836,13156" o:gfxdata="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">
+                <v:group id="Grupo 427205304" o:spid="_x0000_s1027" style="position:absolute;top:4;width:11836;height:13157" coordorigin=",4" coordsize="11836,13156" o:gfxdata="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">
+                  <v:shapetype id="_x0000_t202" coordsize="21600,21600" o:spt="202" path="m,l,21600r21600,l21600,xe">
+                    <v:stroke joinstyle="miter"/>
+                    <v:path gradientshapeok="t" o:connecttype="rect"/>
+                  </v:shapetype>
+                  <v:shape id="Cuadro de texto 663416818" o:spid="_x0000_s1028" type="#_x0000_t202" style="position:absolute;top:4;width:11836;height:13157;visibility:visible;mso-wrap-style:square;v-text-anchor:middle" o:gfxdata="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" filled="f" stroked="f">
+                    <v:textbox>
+                      <w:txbxContent>
+                        <w:p>
+                          <w:pPr>
+                            <w:rPr>
+                              <w:rFonts w:ascii="Arial" w:hAnsi="Arial" w:cs="Arial"/>
+                              <w:noProof/>
+                              <w:sz w:val="18"/>
+                              <w:szCs w:val="18"/>
+                            </w:rPr>
+                          </w:pPr>
+                          <w:r>
+                            <w:rPr>
+                              <w:rFonts w:ascii="Arial" w:hAnsi="Arial" w:cs="Arial"/>
+                              <w:noProof/>
+                              <w:sz w:val="18"/>
+                              <w:szCs w:val="18"/>
+                            </w:rPr>
+                            <w:sym w:font="Symbol" w:char="F0B7"/>
+                          </w:r>
+                          <w:r>
+                            <w:rPr>
+                              <w:rFonts w:ascii="Arial" w:hAnsi="Arial" w:cs="Arial"/>
+                              <w:noProof/>
+                              <w:sz w:val="18"/>
+                              <w:szCs w:val="18"/>
+                            </w:rPr>
+                            <w:t xml:space="preserve"> POLICÍA NACIONAL DEL PERÚ </w:t>
+                          </w:r>
+                          <w:r>
+                            <w:rPr>
+                              <w:rFonts w:ascii="Arial" w:hAnsi="Arial" w:cs="Arial"/>
+                              <w:noProof/>
+                              <w:sz w:val="18"/>
+                              <w:szCs w:val="18"/>
+                            </w:rPr>
+                            <w:sym w:font="Symbol" w:char="F0B7"/>
+                          </w:r>
+                        </w:p>
+                      </w:txbxContent>
+                    </v:textbox>
+                  </v:shape>
+                  <v:group id="Grupo 1179899979" o:spid="_x0000_s1029" style="position:absolute;left:581;top:158;width:10585;height:10627" coordsize="10585,10626" o:gfxdata="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">
+                    <v:shapetype id="_x0000_t75" coordsize="21600,21600" o:spt="75" o:preferrelative="t" path="m@4@5l@4@11@9@11@9@5xe" filled="f" stroked="f">
+                      <v:stroke joinstyle="miter"/>
+                      <v:formulas>
+                        <v:f eqn="if lineDrawn pixelLineWidth 0"/>
+                        <v:f eqn="sum @0 1 0"/>
+                        <v:f eqn="sum 0 0 @1"/>
+                        <v:f eqn="prod @2 1 2"/>
+                        <v:f eqn="prod @3 21600 pixelWidth"/>
+                        <v:f eqn="prod @3 21600 pixelHeight"/>
+                        <v:f eqn="sum @0 0 1"/>
+                        <v:f eqn="prod @6 1 2"/>
+                        <v:f eqn="prod @7 21600 pixelWidth"/>
+                        <v:f eqn="sum @8 21600 0"/>
+                        <v:f eqn="prod @7 21600 pixelHeight"/>
+                        <v:f eqn="sum @10 21600 0"/>
+                      </v:formulas>
+                      <v:path o:extrusionok="f" gradientshapeok="t" o:connecttype="rect"/>
+                      <o:lock v:ext="edit" aspectratio="t"/>
+                    </v:shapetype>
+                    <v:shape id="Imagen 465575216" o:spid="_x0000_s1030" type="#_x0000_t75" alt="selloestado[1]" style="position:absolute;left:3289;top:2828;width:3968;height:5144;visibility:visible;mso-wrap-style:square" o:gfxdata="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">
+                      <v:imagedata r:id="rId8" o:title="selloestado[1]"/>
+                    </v:shape>
+                    <v:group id="Grupo 1249872960" o:spid="_x0000_s1031" style="position:absolute;width:10585;height:10626" coordsize="10585,10626" o:gfxdata="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">
+                      <v:oval id="Elipse 1958472695" o:spid="_x0000_s1032" style="position:absolute;width:10585;height:10626;visibility:visible;mso-wrap-style:square;v-text-anchor:middle" o:gfxdata="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" filled="f" strokecolor="black [3213]">
+                        <v:stroke joinstyle="miter"/>
+                      </v:oval>
+                      <v:oval id="Elipse 420179845" o:spid="_x0000_s1033" style="position:absolute;left:1841;top:1975;width:6938;height:6872;visibility:visible;mso-wrap-style:square;v-text-anchor:middle" o:gfxdata="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" filled="f" strokecolor="black [3213]" strokeweight="1.5pt">
+                        <v:stroke linestyle="thickThin" joinstyle="miter"/>
+                      </v:oval>
+                      <v:oval id="Elipse 779749789" o:spid="_x0000_s1034" style="position:absolute;left:296;top:299;width:10032;height:10094;visibility:visible;mso-wrap-style:square;v-text-anchor:middle" o:gfxdata="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" filled="f" strokecolor="black [3213]" strokeweight=".5pt">
+                        <v:stroke joinstyle="miter"/>
+                      </v:oval>
+                    </v:group>
+                  </v:group>
+                </v:group>
+                <v:shape id="Cuadro de texto 752435379" o:spid="_x0000_s1035" type="#_x0000_t202" style="position:absolute;left:860;top:3395;width:10049;height:7699;visibility:visible;mso-wrap-style:square;v-text-anchor:middle" o:gfxdata="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" filled="f" stroked="f">
+                  <v:textbox>
+                    <w:txbxContent>
+                      <w:p>
+                        <w:pPr>
+                          <w:jc w:val="center"/>
+                          <w:rPr>
+                            <w:rFonts w:ascii="Arial" w:hAnsi="Arial" w:cs="Arial"/>
+                            <w:noProof/>
+                            <w:color w:val="000000" w:themeColor="text1"/>
+                            <w:sz w:val="18"/>
+                            <w:szCs w:val="14"/>
+                            <w14:textOutline w14:w="0" w14:cap="flat" w14:cmpd="sng" w14:algn="ctr">
+                              <w14:noFill/>
+                              <w14:prstDash w14:val="solid"/>
+                              <w14:round/>
+                            </w14:textOutline>
+                          </w:rPr>
+                        </w:pPr>
+                        <w:r>
+                          <w:rPr>
+                            <w:rFonts w:ascii="Arial" w:hAnsi="Arial" w:cs="Arial"/>
+                            <w:noProof/>
+                            <w:color w:val="000000" w:themeColor="text1"/>
+                            <w:sz w:val="18"/>
+                            <w:szCs w:val="14"/>
+                            <w14:textOutline w14:w="0" w14:cap="flat" w14:cmpd="sng" w14:algn="ctr">
+                              <w14:noFill/>
+                              <w14:prstDash w14:val="solid"/>
+                              <w14:round/>
+                            </w14:textOutline>
+                          </w:rPr>
+                          <w:t>DEP</w:t>
+                        </w:r>
+                        <w:r>
+                          <w:rPr>
+                            <w:rFonts w:ascii="Arial" w:hAnsi="Arial" w:cs="Arial"/>
+                            <w:noProof/>
+                            <w:color w:val="000000" w:themeColor="text1"/>
+                            <w:sz w:val="18"/>
+                            <w:szCs w:val="14"/>
+                            <w14:textOutline w14:w="0" w14:cap="flat" w14:cmpd="sng" w14:algn="ctr">
+                              <w14:noFill/>
+                              <w14:prstDash w14:val="solid"/>
+                              <w14:round/>
+                            </w14:textOutline>
+                          </w:rPr>
+                          <w:t>IAT - NORTE</w:t>
+                        </w:r>
+                      </w:p>
+                    </w:txbxContent>
+                  </v:textbox>
+                </v:shape>
+                <w10:wrap anchorx="margin"/>
+              </v:group>
+            </w:pict>
+          </mc:Fallback>
+        </mc:AlternateContent>
+      </w:r>
+      <w:r>
+        <w:rPr>
           <w:rFonts w:ascii="Arial" w:hAnsi="Arial"/>
           <w:sz w:val="24"/>
           <w:szCs w:val="24"/>
@@ -814,81 +1520,9 @@
     </w:p>
     <w:p>
       <w:pPr>
+        <w:ind w:left="4500"/>
         <w:jc w:val="center"/>
-        <w:ind w:left="4500"/>
-        <w:spacing w:after="0"/>
-      </w:pPr>
-      <w:r>
-        <w:rPr>
-          <w:sz w:val="18"/>
-        </w:rPr>
-        <w:t/>
-      </w:r>
-    </w:p>
-    <w:p>
-      <w:pPr>
-        <w:jc w:val="center"/>
-        <w:ind w:left="4500"/>
-        <w:spacing w:after="0"/>
-      </w:pPr>
-      <w:r>
-        <w:rPr>
-          <w:sz w:val="18"/>
-        </w:rPr>
-        <w:t>____________________________</w:t>
-      </w:r>
-    </w:p>
-    <w:p>
-      <w:pPr>
-        <w:jc w:val="center"/>
-        <w:ind w:left="4500"/>
-        <w:spacing w:after="0"/>
-      </w:pPr>
-      <w:r>
-        <w:rPr>
-          <w:sz w:val="18"/>
-        </w:rPr>
-        <w:t>${firma_nombre}</w:t>
-      </w:r>
-    </w:p>
-    <w:p>
-      <w:pPr>
-        <w:jc w:val="center"/>
-        <w:ind w:left="4500"/>
-        <w:spacing w:after="0"/>
-      </w:pPr>
-      <w:r>
-        <w:rPr>
-          <w:sz w:val="18"/>
-        </w:rPr>
-        <w:t>${firma_grado} — CIP ${firma_cip}</w:t>
-      </w:r>
-    </w:p>
-    <w:p>
-      <w:pPr>
-        <w:jc w:val="center"/>
-        <w:ind w:left="4500"/>
-        <w:spacing w:after="0"/>
-      </w:pPr>
-      <w:r>
-        <w:rPr>
-          <w:sz w:val="18"/>
-        </w:rPr>
-        <w:t>${firma_cargo}</w:t>
-      </w:r>
-    </w:p>
-    <w:p>
-      <w:pPr>
-        <w:jc w:val="center"/>
-        <w:ind w:left="4500"/>
-        <w:spacing w:after="0"/>
-      </w:pPr>
-      <w:r>
-        <w:rPr>
-          <w:sz w:val="18"/>
-        </w:rPr>
-        <w:t>${firma_unidad}</w:t>
-      </w:r>
+      </w:pPr>
     </w:p>
     <w:p>
       <w:pPr>
@@ -915,6 +1549,430 @@
           <w:szCs w:val="24"/>
         </w:rPr>
       </w:pPr>
+      <w:r>
+        <w:rPr>
+          <w:noProof/>
+        </w:rPr>
+        <mc:AlternateContent>
+          <mc:Choice Requires="wps">
+            <w:drawing>
+              <wp:anchor distT="0" distB="0" distL="114300" distR="114300" simplePos="0" relativeHeight="251659264" behindDoc="0" locked="0" layoutInCell="1" allowOverlap="1" wp14:anchorId="0B1AF49B" wp14:editId="18565FEA">
+                <wp:simplePos x="0" y="0"/>
+                <wp:positionH relativeFrom="column">
+                  <wp:posOffset>3045279</wp:posOffset>
+                </wp:positionH>
+                <wp:positionV relativeFrom="paragraph">
+                  <wp:posOffset>85997</wp:posOffset>
+                </wp:positionV>
+                <wp:extent cx="2266315" cy="869950"/>
+                <wp:effectExtent l="0" t="0" r="0" b="6350"/>
+                <wp:wrapNone/>
+                <wp:docPr id="44911927" name="Cuadro de texto 1">
+                  <a:extLst xmlns:a="http://schemas.openxmlformats.org/drawingml/2006/main">
+                    <a:ext uri="{147F2762-F138-4A5C-976F-8EAC2B608ADB}">
+                      <a16:predDERef xmlns:a16="http://schemas.microsoft.com/office/drawing/2014/main" pred="{FF73D199-599D-4D2A-B7E9-A1EB9C959DEB}"/>
+                    </a:ext>
+                  </a:extLst>
+                </wp:docPr>
+                <wp:cNvGraphicFramePr>
+                  <a:graphicFrameLocks xmlns:a="http://schemas.openxmlformats.org/drawingml/2006/main"/>
+                </wp:cNvGraphicFramePr>
+                <a:graphic xmlns:a="http://schemas.openxmlformats.org/drawingml/2006/main">
+                  <a:graphicData uri="http://schemas.microsoft.com/office/word/2010/wordprocessingShape">
+                    <wps:wsp>
+                      <wps:cNvSpPr txBox="1">
+                        <a:spLocks noChangeArrowheads="1"/>
+                      </wps:cNvSpPr>
+                      <wps:spPr bwMode="auto">
+                        <a:xfrm>
+                          <a:off x="0" y="0"/>
+                          <a:ext cx="2266315" cy="869950"/>
+                        </a:xfrm>
+                        <a:prstGeom prst="rect">
+                          <a:avLst/>
+                        </a:prstGeom>
+                        <a:noFill/>
+                        <a:ln>
+                          <a:noFill/>
+                        </a:ln>
+                      </wps:spPr>
+                      <wps:txbx>
+                        <w:txbxContent>
+                          <w:p>
+                            <w:pPr>
+                              <w:jc w:val="center"/>
+                              <w:textAlignment w:val="baseline"/>
+                              <w:rPr>
+                                <w:color w:val="000000"/>
+                                <w:sz w:val="13"/>
+                                <w:szCs w:val="13"/>
+                                <w:lang w:val="es-ES"/>
+                              </w:rPr>
+                            </w:pPr>
+                            <w:r>
+                              <w:rPr>
+                                <w:color w:val="000000"/>
+                                <w:sz w:val="13"/>
+                                <w:szCs w:val="13"/>
+                                <w:lang w:val="es-ES"/>
+                              </w:rPr>
+                              <w:t>____________________</w:t>
+                            </w:r>
+                            <w:r>
+                              <w:rPr>
+                                <w:color w:val="000000"/>
+                                <w:sz w:val="13"/>
+                                <w:szCs w:val="13"/>
+                                <w:lang w:val="es-ES"/>
+                              </w:rPr>
+                              <w:t>_________</w:t>
+                            </w:r>
+                            <w:r>
+                              <w:rPr>
+                                <w:color w:val="000000"/>
+                                <w:sz w:val="13"/>
+                                <w:szCs w:val="13"/>
+                                <w:lang w:val="es-ES"/>
+                              </w:rPr>
+                              <w:t>___________</w:t>
+                            </w:r>
+                          </w:p>
+                          <w:p>
+                            <w:pPr>
+                              <w:jc w:val="center"/>
+                              <w:textAlignment w:val="baseline"/>
+                              <w:rPr>
+                                <w:rFonts w:ascii="Arial Narrow" w:eastAsia="Arial Unicode MS" w:hAnsi="Arial Narrow" w:cs="Arial Unicode MS"/>
+                                <w:b/>
+                                <w:bCs/>
+                                <w:color w:val="000000"/>
+                                <w:sz w:val="18"/>
+                                <w:szCs w:val="18"/>
+                              </w:rPr>
+                            </w:pPr>
+                            <w:r>
+                              <w:rPr>
+                                <w:rFonts w:ascii="Arial Narrow" w:eastAsia="Arial Unicode MS" w:hAnsi="Arial Narrow" w:cs="Arial Unicode MS"/>
+                                <w:b/>
+                                <w:bCs/>
+                                <w:color w:val="000000"/>
+                                <w:sz w:val="18"/>
+                                <w:szCs w:val="18"/>
+                              </w:rPr>
+                              <w:t>OA-337651</w:t>
+                            </w:r>
+                          </w:p>
+                          <w:p>
+                            <w:pPr>
+                              <w:jc w:val="center"/>
+                              <w:textAlignment w:val="baseline"/>
+                              <w:rPr>
+                                <w:rFonts w:ascii="Arial Narrow" w:eastAsia="Arial Unicode MS" w:hAnsi="Arial Narrow"/>
+                                <w:b/>
+                                <w:bCs/>
+                                <w:color w:val="000000"/>
+                                <w:sz w:val="18"/>
+                                <w:szCs w:val="18"/>
+                              </w:rPr>
+                            </w:pPr>
+                            <w:r>
+                              <w:rPr>
+                                <w:rFonts w:ascii="Arial Narrow" w:eastAsia="Arial Unicode MS" w:hAnsi="Arial Narrow"/>
+                                <w:b/>
+                                <w:bCs/>
+                                <w:color w:val="000000"/>
+                                <w:sz w:val="18"/>
+                                <w:szCs w:val="18"/>
+                              </w:rPr>
+                              <w:t>José</w:t>
+                            </w:r>
+                            <w:r>
+                              <w:rPr>
+                                <w:rFonts w:ascii="Arial Narrow" w:eastAsia="Arial Unicode MS" w:hAnsi="Arial Narrow"/>
+                                <w:b/>
+                                <w:bCs/>
+                                <w:color w:val="000000"/>
+                                <w:sz w:val="18"/>
+                                <w:szCs w:val="18"/>
+                              </w:rPr>
+                              <w:t xml:space="preserve"> Antonio SUASNABAR VIDARTE</w:t>
+                            </w:r>
+                          </w:p>
+                          <w:p>
+                            <w:pPr>
+                              <w:ind w:firstLine="144"/>
+                              <w:jc w:val="center"/>
+                              <w:textAlignment w:val="baseline"/>
+                              <w:rPr>
+                                <w:rFonts w:ascii="Arial Narrow" w:eastAsia="Arial Unicode MS" w:hAnsi="Arial Narrow" w:cs="Arial Unicode MS"/>
+                                <w:b/>
+                                <w:bCs/>
+                                <w:color w:val="000000"/>
+                                <w:sz w:val="18"/>
+                                <w:szCs w:val="18"/>
+                              </w:rPr>
+                            </w:pPr>
+                            <w:r>
+                              <w:rPr>
+                                <w:rFonts w:ascii="Arial Narrow" w:eastAsia="Arial Unicode MS" w:hAnsi="Arial Narrow" w:cs="Arial Unicode MS"/>
+                                <w:b/>
+                                <w:bCs/>
+                                <w:color w:val="000000"/>
+                                <w:sz w:val="18"/>
+                                <w:szCs w:val="18"/>
+                              </w:rPr>
+                              <w:t>COMANDANTE PNP</w:t>
+                            </w:r>
+                          </w:p>
+                          <w:p>
+                            <w:pPr>
+                              <w:jc w:val="center"/>
+                              <w:textAlignment w:val="baseline"/>
+                              <w:rPr>
+                                <w:rFonts w:ascii="Arial Narrow" w:hAnsi="Arial Narrow"/>
+                                <w:b/>
+                                <w:bCs/>
+                                <w:color w:val="000000"/>
+                                <w:sz w:val="14"/>
+                                <w:szCs w:val="14"/>
+                              </w:rPr>
+                            </w:pPr>
+                            <w:r>
+                              <w:rPr>
+                                <w:rFonts w:ascii="Arial Narrow" w:hAnsi="Arial Narrow"/>
+                                <w:b/>
+                                <w:bCs/>
+                                <w:color w:val="000000"/>
+                                <w:sz w:val="14"/>
+                                <w:szCs w:val="14"/>
+                              </w:rPr>
+                              <w:t xml:space="preserve">JEFE DE LA UNIDAD DE INVESTIGACIÓN </w:t>
+                            </w:r>
+                          </w:p>
+                          <w:p>
+                            <w:pPr>
+                              <w:jc w:val="center"/>
+                              <w:textAlignment w:val="baseline"/>
+                              <w:rPr>
+                                <w:rFonts w:ascii="Arial Narrow" w:hAnsi="Arial Narrow"/>
+                                <w:b/>
+                                <w:bCs/>
+                                <w:color w:val="000000"/>
+                                <w:sz w:val="14"/>
+                                <w:szCs w:val="14"/>
+                              </w:rPr>
+                            </w:pPr>
+                            <w:r>
+                              <w:rPr>
+                                <w:rFonts w:ascii="Arial Narrow" w:hAnsi="Arial Narrow"/>
+                                <w:b/>
+                                <w:bCs/>
+                                <w:color w:val="000000"/>
+                                <w:sz w:val="14"/>
+                                <w:szCs w:val="14"/>
+                              </w:rPr>
+                              <w:t>DE ACCIDENTES DE TRÁNSITO LIMA NORTE</w:t>
+                            </w:r>
+                          </w:p>
+                        </w:txbxContent>
+                      </wps:txbx>
+                      <wps:bodyPr rot="0" vert="horz" wrap="square" lIns="91440" tIns="45720" rIns="91440" bIns="45720" anchor="t" anchorCtr="0" upright="1">
+                        <a:noAutofit/>
+                      </wps:bodyPr>
+                    </wps:wsp>
+                  </a:graphicData>
+                </a:graphic>
+              </wp:anchor>
+            </w:drawing>
+          </mc:Choice>
+          <mc:Fallback>
+            <w:pict>
+              <v:shape w14:anchorId="0B1AF49B" id="Cuadro de texto 1" o:spid="_x0000_s1036" type="#_x0000_t202" style="position:absolute;left:0;text-align:left;margin-left:239.8pt;margin-top:6.75pt;width:178.45pt;height:68.5pt;z-index:251659264;visibility:visible;mso-wrap-style:square;mso-wrap-distance-left:9pt;mso-wrap-distance-top:0;mso-wrap-distance-right:9pt;mso-wrap-distance-bottom:0;mso-position-horizontal:absolute;mso-position-horizontal-relative:text;mso-position-vertical:absolute;mso-position-vertical-relative:text;v-text-anchor:top" o:gfxdata="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" filled="f" stroked="f">
+                <v:textbox>
+                  <w:txbxContent>
+                    <w:p>
+                      <w:pPr>
+                        <w:jc w:val="center"/>
+                        <w:textAlignment w:val="baseline"/>
+                        <w:rPr>
+                          <w:color w:val="000000"/>
+                          <w:sz w:val="13"/>
+                          <w:szCs w:val="13"/>
+                          <w:lang w:val="es-ES"/>
+                        </w:rPr>
+                      </w:pPr>
+                      <w:r>
+                        <w:rPr>
+                          <w:color w:val="000000"/>
+                          <w:sz w:val="13"/>
+                          <w:szCs w:val="13"/>
+                          <w:lang w:val="es-ES"/>
+                        </w:rPr>
+                        <w:t>____________________</w:t>
+                      </w:r>
+                      <w:r>
+                        <w:rPr>
+                          <w:color w:val="000000"/>
+                          <w:sz w:val="13"/>
+                          <w:szCs w:val="13"/>
+                          <w:lang w:val="es-ES"/>
+                        </w:rPr>
+                        <w:t>_________</w:t>
+                      </w:r>
+                      <w:r>
+                        <w:rPr>
+                          <w:color w:val="000000"/>
+                          <w:sz w:val="13"/>
+                          <w:szCs w:val="13"/>
+                          <w:lang w:val="es-ES"/>
+                        </w:rPr>
+                        <w:t>___________</w:t>
+                      </w:r>
+                    </w:p>
+                    <w:p>
+                      <w:pPr>
+                        <w:jc w:val="center"/>
+                        <w:textAlignment w:val="baseline"/>
+                        <w:rPr>
+                          <w:rFonts w:ascii="Arial Narrow" w:eastAsia="Arial Unicode MS" w:hAnsi="Arial Narrow" w:cs="Arial Unicode MS"/>
+                          <w:b/>
+                          <w:bCs/>
+                          <w:color w:val="000000"/>
+                          <w:sz w:val="18"/>
+                          <w:szCs w:val="18"/>
+                        </w:rPr>
+                      </w:pPr>
+                      <w:r>
+                        <w:rPr>
+                          <w:rFonts w:ascii="Arial Narrow" w:eastAsia="Arial Unicode MS" w:hAnsi="Arial Narrow" w:cs="Arial Unicode MS"/>
+                          <w:b/>
+                          <w:bCs/>
+                          <w:color w:val="000000"/>
+                          <w:sz w:val="18"/>
+                          <w:szCs w:val="18"/>
+                        </w:rPr>
+                        <w:t>OA-337651</w:t>
+                      </w:r>
+                    </w:p>
+                    <w:p>
+                      <w:pPr>
+                        <w:jc w:val="center"/>
+                        <w:textAlignment w:val="baseline"/>
+                        <w:rPr>
+                          <w:rFonts w:ascii="Arial Narrow" w:eastAsia="Arial Unicode MS" w:hAnsi="Arial Narrow"/>
+                          <w:b/>
+                          <w:bCs/>
+                          <w:color w:val="000000"/>
+                          <w:sz w:val="18"/>
+                          <w:szCs w:val="18"/>
+                        </w:rPr>
+                      </w:pPr>
+                      <w:r>
+                        <w:rPr>
+                          <w:rFonts w:ascii="Arial Narrow" w:eastAsia="Arial Unicode MS" w:hAnsi="Arial Narrow"/>
+                          <w:b/>
+                          <w:bCs/>
+                          <w:color w:val="000000"/>
+                          <w:sz w:val="18"/>
+                          <w:szCs w:val="18"/>
+                        </w:rPr>
+                        <w:t>José</w:t>
+                      </w:r>
+                      <w:r>
+                        <w:rPr>
+                          <w:rFonts w:ascii="Arial Narrow" w:eastAsia="Arial Unicode MS" w:hAnsi="Arial Narrow"/>
+                          <w:b/>
+                          <w:bCs/>
+                          <w:color w:val="000000"/>
+                          <w:sz w:val="18"/>
+                          <w:szCs w:val="18"/>
+                        </w:rPr>
+                        <w:t xml:space="preserve"> Antonio SUASNABAR VIDARTE</w:t>
+                      </w:r>
+                    </w:p>
+                    <w:p>
+                      <w:pPr>
+                        <w:ind w:firstLine="144"/>
+                        <w:jc w:val="center"/>
+                        <w:textAlignment w:val="baseline"/>
+                        <w:rPr>
+                          <w:rFonts w:ascii="Arial Narrow" w:eastAsia="Arial Unicode MS" w:hAnsi="Arial Narrow" w:cs="Arial Unicode MS"/>
+                          <w:b/>
+                          <w:bCs/>
+                          <w:color w:val="000000"/>
+                          <w:sz w:val="18"/>
+                          <w:szCs w:val="18"/>
+                        </w:rPr>
+                      </w:pPr>
+                      <w:r>
+                        <w:rPr>
+                          <w:rFonts w:ascii="Arial Narrow" w:eastAsia="Arial Unicode MS" w:hAnsi="Arial Narrow" w:cs="Arial Unicode MS"/>
+                          <w:b/>
+                          <w:bCs/>
+                          <w:color w:val="000000"/>
+                          <w:sz w:val="18"/>
+                          <w:szCs w:val="18"/>
+                        </w:rPr>
+                        <w:t>COMANDANTE PNP</w:t>
+                      </w:r>
+                    </w:p>
+                    <w:p>
+                      <w:pPr>
+                        <w:jc w:val="center"/>
+                        <w:textAlignment w:val="baseline"/>
+                        <w:rPr>
+                          <w:rFonts w:ascii="Arial Narrow" w:hAnsi="Arial Narrow"/>
+                          <w:b/>
+                          <w:bCs/>
+                          <w:color w:val="000000"/>
+                          <w:sz w:val="14"/>
+                          <w:szCs w:val="14"/>
+                        </w:rPr>
+                      </w:pPr>
+                      <w:r>
+                        <w:rPr>
+                          <w:rFonts w:ascii="Arial Narrow" w:hAnsi="Arial Narrow"/>
+                          <w:b/>
+                          <w:bCs/>
+                          <w:color w:val="000000"/>
+                          <w:sz w:val="14"/>
+                          <w:szCs w:val="14"/>
+                        </w:rPr>
+                        <w:t xml:space="preserve">JEFE DE LA UNIDAD DE INVESTIGACIÓN </w:t>
+                      </w:r>
+                    </w:p>
+                    <w:p>
+                      <w:pPr>
+                        <w:jc w:val="center"/>
+                        <w:textAlignment w:val="baseline"/>
+                        <w:rPr>
+                          <w:rFonts w:ascii="Arial Narrow" w:hAnsi="Arial Narrow"/>
+                          <w:b/>
+                          <w:bCs/>
+                          <w:color w:val="000000"/>
+                          <w:sz w:val="14"/>
+                          <w:szCs w:val="14"/>
+                        </w:rPr>
+                      </w:pPr>
+                      <w:r>
+                        <w:rPr>
+                          <w:rFonts w:ascii="Arial Narrow" w:hAnsi="Arial Narrow"/>
+                          <w:b/>
+                          <w:bCs/>
+                          <w:color w:val="000000"/>
+                          <w:sz w:val="14"/>
+                          <w:szCs w:val="14"/>
+                        </w:rPr>
+                        <w:t>DE ACCIDENTES DE TRÁNSITO LIMA NORTE</w:t>
+                      </w:r>
+                    </w:p>
+                  </w:txbxContent>
+                </v:textbox>
+              </v:shape>
+            </w:pict>
+          </mc:Fallback>
+        </mc:AlternateContent>
+      </w:r>
     </w:p>
     <w:p>
       <w:pPr>
@@ -1053,7 +2111,14 @@
         <w:rFonts w:ascii="Calibri" w:hAnsi="Calibri"/>
         <w:sz w:val="18"/>
       </w:rPr>
-      <w:t>987951522/</w:t>
+      <w:t>986571975</w:t>
+    </w:r>
+    <w:r>
+      <w:rPr>
+        <w:rFonts w:ascii="Calibri" w:hAnsi="Calibri"/>
+        <w:sz w:val="18"/>
+      </w:rPr>
+      <w:t>/</w:t>
     </w:r>
     <w:r>
       <w:rPr>
@@ -1068,22 +2133,25 @@
       <w:pStyle w:val="Piedepgina"/>
       <w:jc w:val="center"/>
       <w:rPr>
-        <w:rFonts w:ascii="Calibri" w:hAnsi="Calibri"/>
-        <w:sz w:val="18"/>
+        <w:lang w:val="en-US"/>
       </w:rPr>
     </w:pPr>
     <w:r>
       <w:rPr>
         <w:rFonts w:ascii="Calibri" w:hAnsi="Calibri"/>
         <w:sz w:val="18"/>
+        <w:lang w:val="en-US"/>
       </w:rPr>
-      <w:t>Email: uiat.norte@gmail.com</w:t>
+      <w:t xml:space="preserve">Email: </w:t>
     </w:r>
-  </w:p>
-  <w:p>
-    <w:pPr>
-      <w:pStyle w:val="Piedepgina"/>
-    </w:pPr>
+    <w:r>
+      <w:rPr>
+        <w:rFonts w:ascii="Calibri" w:hAnsi="Calibri"/>
+        <w:sz w:val="18"/>
+        <w:lang w:val="en-US"/>
+      </w:rPr>
+      <w:t>divpiat.norte@policia.gob.pe</w:t>
+    </w:r>
   </w:p>
 </w:ftr>
 </file>
@@ -1118,7 +2186,7 @@
         <w:noProof/>
         <w:lang w:val="es-PE" w:eastAsia="es-PE"/>
       </w:rPr>
-      <w:pict w14:anchorId="6C42208F">
+      <w:pict w14:anchorId="2AA3DF96">
         <v:shapetype id="_x0000_t75" coordsize="21600,21600" o:spt="75" o:preferrelative="t" path="m@4@5l@4@11@9@11@9@5xe" filled="f" stroked="f">
           <v:stroke joinstyle="miter"/>
           <v:formulas>
@@ -1804,7 +2872,7 @@
         <w:noProof/>
         <w:lang w:val="es-PE" w:eastAsia="es-PE"/>
       </w:rPr>
-      <w:pict w14:anchorId="105DB3AB">
+      <w:pict w14:anchorId="465FC665">
         <v:shapetype id="_x0000_t75" coordsize="21600,21600" o:spt="75" o:preferrelative="t" path="m@4@5l@4@11@9@11@9@5xe" filled="f" stroked="f">
           <v:stroke joinstyle="miter"/>
           <v:formulas>

</xml_diff>